<commit_message>
Cite only official TypeSafe sources in the handout and README
Replace third-party citations with TypeSafe docs where an official
source exists; drop claims without one (service location, past
signup pause).

Co-Authored-By: Claude Opus 5.5 <noreply@anthropic.com>
</commit_message>
<xml_diff>
--- a/handout/Jev講義.docx
+++ b/handout/Jev講義.docx
@@ -6258,7 +6258,7 @@
                 <w:sz w:val="20"/>
                 <w:szCs w:val="20"/>
               </w:rPr>
-              <w:t xml:space="preserve">官方表示不會用客戶資料訓練模型；服務架設在美國，個資與機密請先遮蔽</w:t>
+              <w:t xml:space="preserve">官方表示不會用客戶資料訓練模型</w:t>
             </w:r>
             <w:r>
               <w:rPr>
@@ -6273,7 +6273,7 @@
                 <w:sz w:val="20"/>
                 <w:szCs w:val="20"/>
               </w:rPr>
-              <w:t xml:space="preserve">。註冊狀態請看 typesafe.ai 公告</w:t>
+              <w:t xml:space="preserve">；資料仍會送到 TypeSafe 處理，個資與機密請先遮蔽。註冊狀態請看 typesafe.ai 公告</w:t>
             </w:r>
             <w:r>
               <w:rPr>
@@ -6305,7 +6305,7 @@
           <w:sz w:val="16"/>
           <w:szCs w:val="16"/>
         </w:rPr>
-        <w:t xml:space="preserve">延伸閱讀：docs.typesafe.ai（官方文件與 cookbooks）　·　flaviocopes.com/jev（入門長文）。註腳引用之網址皆於 2026/09/29 逐一開啟，核對內文確有所引述之內容。</w:t>
+        <w:t xml:space="preserve">延伸閱讀：docs.typesafe.ai（官方文件與 cookbooks）。註腳引用之網址皆於 2026/09/29 逐一開啟，核對內文確有所引述之內容。</w:t>
       </w:r>
     </w:p>
     <w:sectPr>
@@ -6470,7 +6470,7 @@
           <w:sz w:val="14"/>
           <w:szCs w:val="14"/>
         </w:rPr>
-        <w:t xml:space="preserve">Flavio Copes〈A deep dive into Jev〉：“It does not write replies, explanations, or code.” flaviocopes.com/jev</w:t>
+        <w:t xml:space="preserve">官方 Jev with coding agents：“It does not generate text, write code, or hold a conversation.” docs.typesafe.ai/introduction/coding-agents</w:t>
       </w:r>
     </w:p>
   </w:footnote>
@@ -6602,7 +6602,7 @@
           <w:sz w:val="14"/>
           <w:szCs w:val="14"/>
         </w:rPr>
-        <w:t xml:space="preserve">Flavio Copes〈How to get access to Jev and an API key〉：“Continue with Google … Email me a code instead.” flaviocopes.com/jev-api-key</w:t>
+        <w:t xml:space="preserve">講師 2026/09/29 開啟 console.typesafe.ai 登入頁實際看到的選項：“Continue with Google”、“Email me a code instead”。</w:t>
       </w:r>
     </w:p>
   </w:footnote>
@@ -6646,7 +6646,7 @@
           <w:sz w:val="14"/>
           <w:szCs w:val="14"/>
         </w:rPr>
-        <w:t xml:space="preserve">同註 2：“The ID is for your code and is not sent to the model.”</w:t>
+        <w:t xml:space="preserve">官方 Primitives：“Question IDs are for your code. They are not sent to the model.” docs.typesafe.ai/primitives</w:t>
       </w:r>
     </w:p>
   </w:footnote>
@@ -6800,7 +6800,7 @@
           <w:sz w:val="14"/>
           <w:szCs w:val="14"/>
         </w:rPr>
-        <w:t xml:space="preserve">TypeSafe 首頁：“$42 Per Billion input tokens” typesafe.ai；輸出免費：flaviocopes.com/jev-pricing。token 數為實測，匯率為概估。</w:t>
+        <w:t xml:space="preserve">TypeSafe 首頁：“$42 Per Billion input tokens” typesafe.ai；官方 Models：“Output tokens are free.” docs.typesafe.ai/models。token 數為實測，匯率為概估。</w:t>
       </w:r>
     </w:p>
   </w:footnote>
@@ -6844,7 +6844,7 @@
           <w:sz w:val="14"/>
           <w:szCs w:val="14"/>
         </w:rPr>
-        <w:t xml:space="preserve">官方 Models：“Jev is not trained on customer requests or responses.” 服務位置：同註 2（“US West Coast where the service runs”）。</w:t>
+        <w:t xml:space="preserve">官方 Models：“Jev is not trained on customer requests or responses.” docs.typesafe.ai/models</w:t>
       </w:r>
     </w:p>
   </w:footnote>
@@ -6866,7 +6866,7 @@
           <w:sz w:val="14"/>
           <w:szCs w:val="14"/>
         </w:rPr>
-        <w:t xml:space="preserve">TypeSafe 首頁 2026/09/27：“TypeSafe is now open to everyone” typesafe.ai；9/22 曾暫停註冊（同註 8）。</w:t>
+        <w:t xml:space="preserve">TypeSafe 首頁 2026/09/27：“TypeSafe is now open to everyone” typesafe.ai</w:t>
       </w:r>
     </w:p>
   </w:footnote>

</xml_diff>